<commit_message>
Update technical report with QR request flow and economic offer
Co-Authored-By: Claude Opus 5.5 <noreply@anthropic.com>
</commit_message>
<xml_diff>
--- a/relazione/offerta-economica.docx
+++ b/relazione/offerta-economica.docx
@@ -3,11 +3,21 @@
 <w:document xmlns:wpc="http://schemas.microsoft.com/office/word/2010/wordprocessingCanvas" xmlns:mo="http://schemas.microsoft.com/office/mac/office/2008/main" xmlns:mc="http://schemas.openxmlformats.org/markup-compatibility/2006" xmlns:mv="urn:schemas-microsoft-com:mac:vml" xmlns:o="urn:schemas-microsoft-com:office:office" xmlns:r="http://schemas.openxmlformats.org/officeDocument/2006/relationships" xmlns:m="http://schemas.openxmlformats.org/officeDocument/2006/math" xmlns:v="urn:schemas-microsoft-com:vml" xmlns:wp14="http://schemas.microsoft.com/office/word/2010/wordprocessingDrawing" xmlns:wp="http://schemas.openxmlformats.org/drawingml/2006/wordprocessingDrawing" xmlns:w10="urn:schemas-microsoft-com:office:word" xmlns:w="http://schemas.openxmlformats.org/wordprocessingml/2006/main" xmlns:w14="http://schemas.microsoft.com/office/word/2010/wordml" xmlns:wpg="http://schemas.microsoft.com/office/word/2010/wordprocessingGroup" xmlns:wpi="http://schemas.microsoft.com/office/word/2010/wordprocessingInk" xmlns:wne="http://schemas.microsoft.com/office/word/2006/wordml" xmlns:wps="http://schemas.microsoft.com/office/word/2010/wordprocessingShape" mc:Ignorable="w14 wp14">
   <w:body>
     <w:p>
+      <w:r>
+        <w:rPr>
+          <w:b/>
+          <w:color w:val="595959"/>
+          <w:sz w:val="18"/>
+        </w:rPr>
+        <w:t>COMUNE DI GATTAPELATA · RISPOSTA AL BANDO</w:t>
+      </w:r>
+    </w:p>
+    <w:p>
       <w:pPr>
         <w:pStyle w:val="Title"/>
       </w:pPr>
       <w:r>
-        <w:t>Offerta economica</w:t>
+        <w:t>AttraversiAMO</w:t>
       </w:r>
     </w:p>
     <w:p>
@@ -19,8 +29,9 @@
       <w:r>
         <w:rPr>
           <w:b/>
+          <w:sz w:val="28"/>
         </w:rPr>
-        <w:t>AttraversiAMO</w:t>
+        <w:t>Offerta economica</w:t>
       </w:r>
     </w:p>
     <w:p>
@@ -31,10 +42,10 @@
         <w:rPr>
           <w:b/>
         </w:rPr>
-        <w:t xml:space="preserve">Progetto: </w:t>
+        <w:t xml:space="preserve">Oggetto: </w:t>
       </w:r>
       <w:r>
-        <w:t>Sviluppo, distribuzione e mantenimento dell'app per la mobilità urbana degli anziani (centro storico)</w:t>
+        <w:t>Sviluppo, distribuzione e mantenimento di AttraversiAMO, l'app che aiuta le persone anziane ad attraversare i vicoli del centro storico</w:t>
       </w:r>
     </w:p>
     <w:p>
@@ -48,7 +59,7 @@
         <w:t xml:space="preserve">Committente: </w:t>
       </w:r>
       <w:r>
-        <w:t>Comune / Ente Locale</w:t>
+        <w:t>Comune di Gattapelata</w:t>
       </w:r>
     </w:p>
     <w:p>
@@ -67,15 +78,355 @@
     </w:p>
     <w:p>
       <w:pPr>
+        <w:spacing w:after="40"/>
+      </w:pPr>
+      <w:r>
+        <w:rPr>
+          <w:b/>
+        </w:rPr>
+        <w:t xml:space="preserve">Data: </w:t>
+      </w:r>
+      <w:r>
+        <w:t>12/10/2026</w:t>
+      </w:r>
+    </w:p>
+    <w:p>
+      <w:pPr>
         <w:pStyle w:val="Heading1"/>
       </w:pPr>
       <w:r>
-        <w:t>1. Costi di setup e sviluppo (una tantum)</w:t>
+        <w:t>1. Sintesi dell'offerta</w:t>
       </w:r>
     </w:p>
     <w:p>
+      <w:pPr>
+        <w:spacing w:after="120"/>
+      </w:pPr>
       <w:r>
-        <w:t>Questa voce copre l'analisi, lo sviluppo delle due PWA, la configurazione dei servizi cloud, la generazione, stampa e impermeabilizzazione dei QR code fisici e la produzione del materiale di marketing cartaceo.</w:t>
+        <w:t>AttraversiAMO costa € 2.550,00 una tantum per sviluppo e avviamento, più un canone di € 800,00 l'anno per infrastruttura, manutenzione e supporto. Il primo anno di servizio costa quindi € 3.350,00 in tutto.</w:t>
+      </w:r>
+    </w:p>
+    <w:tbl>
+      <w:tblPr>
+        <w:tblStyle w:val="TableGrid"/>
+        <w:tblW w:type="auto" w:w="0"/>
+        <w:jc w:val="center"/>
+        <w:tblLook w:firstColumn="1" w:firstRow="1" w:lastColumn="0" w:lastRow="0" w:noHBand="0" w:noVBand="1" w:val="04A0"/>
+      </w:tblPr>
+      <w:tblGrid>
+        <w:gridCol w:w="4819"/>
+        <w:gridCol w:w="4819"/>
+      </w:tblGrid>
+      <w:tr>
+        <w:tc>
+          <w:tcPr>
+            <w:tcW w:type="dxa" w:w="6236"/>
+            <w:shd w:val="clear" w:color="auto" w:fill="1F4E79"/>
+          </w:tcPr>
+          <w:p>
+            <w:r/>
+            <w:r>
+              <w:rPr>
+                <w:b/>
+                <w:color w:val="FFFFFF"/>
+              </w:rPr>
+              <w:t>Voce</w:t>
+            </w:r>
+          </w:p>
+        </w:tc>
+        <w:tc>
+          <w:tcPr>
+            <w:tcW w:type="dxa" w:w="3402"/>
+            <w:shd w:val="clear" w:color="auto" w:fill="1F4E79"/>
+          </w:tcPr>
+          <w:p>
+            <w:pPr>
+              <w:jc w:val="right"/>
+            </w:pPr>
+            <w:r/>
+            <w:r>
+              <w:rPr>
+                <w:b/>
+                <w:color w:val="FFFFFF"/>
+              </w:rPr>
+              <w:t>Importo</w:t>
+            </w:r>
+          </w:p>
+        </w:tc>
+      </w:tr>
+      <w:tr>
+        <w:tc>
+          <w:tcPr>
+            <w:tcW w:type="dxa" w:w="6236"/>
+          </w:tcPr>
+          <w:p>
+            <w:r/>
+            <w:r>
+              <w:rPr>
+                <w:b w:val="0"/>
+              </w:rPr>
+              <w:t>Setup e avviamento (una tantum)</w:t>
+            </w:r>
+          </w:p>
+        </w:tc>
+        <w:tc>
+          <w:tcPr>
+            <w:tcW w:type="dxa" w:w="3402"/>
+          </w:tcPr>
+          <w:p>
+            <w:pPr>
+              <w:jc w:val="right"/>
+            </w:pPr>
+            <w:r/>
+            <w:r>
+              <w:rPr>
+                <w:b w:val="0"/>
+              </w:rPr>
+              <w:t>€ 2.550,00</w:t>
+            </w:r>
+          </w:p>
+        </w:tc>
+      </w:tr>
+      <w:tr>
+        <w:tc>
+          <w:tcPr>
+            <w:tcW w:type="dxa" w:w="6236"/>
+          </w:tcPr>
+          <w:p>
+            <w:r/>
+            <w:r>
+              <w:rPr>
+                <w:b w:val="0"/>
+              </w:rPr>
+              <w:t>Canone annuale</w:t>
+            </w:r>
+          </w:p>
+        </w:tc>
+        <w:tc>
+          <w:tcPr>
+            <w:tcW w:type="dxa" w:w="3402"/>
+          </w:tcPr>
+          <w:p>
+            <w:pPr>
+              <w:jc w:val="right"/>
+            </w:pPr>
+            <w:r/>
+            <w:r>
+              <w:rPr>
+                <w:b w:val="0"/>
+              </w:rPr>
+              <w:t>€ 800,00 / anno</w:t>
+            </w:r>
+          </w:p>
+        </w:tc>
+      </w:tr>
+      <w:tr>
+        <w:tc>
+          <w:tcPr>
+            <w:tcW w:type="dxa" w:w="6236"/>
+          </w:tcPr>
+          <w:p>
+            <w:r/>
+            <w:r>
+              <w:rPr>
+                <w:b w:val="0"/>
+              </w:rPr>
+              <w:t>Costo per vicolo, setup (20 vicoli)</w:t>
+            </w:r>
+          </w:p>
+        </w:tc>
+        <w:tc>
+          <w:tcPr>
+            <w:tcW w:type="dxa" w:w="3402"/>
+          </w:tcPr>
+          <w:p>
+            <w:pPr>
+              <w:jc w:val="right"/>
+            </w:pPr>
+            <w:r/>
+            <w:r>
+              <w:rPr>
+                <w:b w:val="0"/>
+              </w:rPr>
+              <w:t>€ 127,50</w:t>
+            </w:r>
+          </w:p>
+        </w:tc>
+      </w:tr>
+      <w:tr>
+        <w:tc>
+          <w:tcPr>
+            <w:tcW w:type="dxa" w:w="6236"/>
+          </w:tcPr>
+          <w:p>
+            <w:r/>
+            <w:r>
+              <w:rPr>
+                <w:b w:val="0"/>
+              </w:rPr>
+              <w:t>Costo per vicolo, canone (20 vicoli)</w:t>
+            </w:r>
+          </w:p>
+        </w:tc>
+        <w:tc>
+          <w:tcPr>
+            <w:tcW w:type="dxa" w:w="3402"/>
+          </w:tcPr>
+          <w:p>
+            <w:pPr>
+              <w:jc w:val="right"/>
+            </w:pPr>
+            <w:r/>
+            <w:r>
+              <w:rPr>
+                <w:b w:val="0"/>
+              </w:rPr>
+              <w:t>€ 40,00 / anno</w:t>
+            </w:r>
+          </w:p>
+        </w:tc>
+      </w:tr>
+      <w:tr>
+        <w:tc>
+          <w:tcPr>
+            <w:tcW w:type="dxa" w:w="6236"/>
+            <w:shd w:val="clear" w:color="auto" w:fill="DCE6F1"/>
+          </w:tcPr>
+          <w:p>
+            <w:r/>
+            <w:r>
+              <w:rPr>
+                <w:b/>
+              </w:rPr>
+              <w:t>Totale primo anno</w:t>
+            </w:r>
+          </w:p>
+        </w:tc>
+        <w:tc>
+          <w:tcPr>
+            <w:tcW w:type="dxa" w:w="3402"/>
+            <w:shd w:val="clear" w:color="auto" w:fill="DCE6F1"/>
+          </w:tcPr>
+          <w:p>
+            <w:pPr>
+              <w:jc w:val="right"/>
+            </w:pPr>
+            <w:r/>
+            <w:r>
+              <w:rPr>
+                <w:b/>
+              </w:rPr>
+              <w:t>€ 3.350,00</w:t>
+            </w:r>
+          </w:p>
+        </w:tc>
+      </w:tr>
+    </w:tbl>
+    <w:p>
+      <w:pPr>
+        <w:spacing w:after="0"/>
+      </w:pPr>
+    </w:p>
+    <w:p>
+      <w:pPr>
+        <w:pStyle w:val="Heading1"/>
+      </w:pPr>
+      <w:r>
+        <w:t>2. Perché il costo è contenuto</w:t>
+      </w:r>
+    </w:p>
+    <w:p>
+      <w:pPr>
+        <w:spacing w:after="120"/>
+      </w:pPr>
+      <w:r>
+        <w:t>L'unica infrastruttura fisica è un cartello con codice QR all'imbocco di ogni vicolo. Tutto il resto si appoggia su strumenti che le persone hanno già: il telefono e la disponibilità dei volontari del quartiere.</w:t>
+      </w:r>
+    </w:p>
+    <w:p>
+      <w:pPr>
+        <w:pStyle w:val="ListBullet"/>
+      </w:pPr>
+      <w:r>
+        <w:rPr>
+          <w:b/>
+        </w:rPr>
+        <w:t xml:space="preserve">Nessun lavoro stradale: </w:t>
+      </w:r>
+      <w:r>
+        <w:t>niente semafori, sensori, cablaggi o permessi di scavo.</w:t>
+      </w:r>
+    </w:p>
+    <w:p>
+      <w:pPr>
+        <w:pStyle w:val="ListBullet"/>
+      </w:pPr>
+      <w:r>
+        <w:rPr>
+          <w:b/>
+        </w:rPr>
+        <w:t xml:space="preserve">Nessun dispositivo da acquistare: </w:t>
+      </w:r>
+      <w:r>
+        <w:t>anziani e volontari usano il proprio telefono.</w:t>
+      </w:r>
+    </w:p>
+    <w:p>
+      <w:pPr>
+        <w:pStyle w:val="ListBullet"/>
+      </w:pPr>
+      <w:r>
+        <w:rPr>
+          <w:b/>
+        </w:rPr>
+        <w:t xml:space="preserve">Nessuno store: </w:t>
+      </w:r>
+      <w:r>
+        <w:t>l'app si apre dal browser e si installa come PWA, senza costi di pubblicazione.</w:t>
+      </w:r>
+    </w:p>
+    <w:p>
+      <w:pPr>
+        <w:pStyle w:val="ListBullet"/>
+      </w:pPr>
+      <w:r>
+        <w:rPr>
+          <w:b/>
+        </w:rPr>
+        <w:t xml:space="preserve">Servizi cloud a consumo: </w:t>
+      </w:r>
+      <w:r>
+        <w:t>hosting e database restano entro piani a basso costo per i volumi di un centro storico.</w:t>
+      </w:r>
+    </w:p>
+    <w:p>
+      <w:pPr>
+        <w:pStyle w:val="ListBullet"/>
+      </w:pPr>
+      <w:r>
+        <w:rPr>
+          <w:b/>
+        </w:rPr>
+        <w:t xml:space="preserve">Volontari: </w:t>
+      </w:r>
+      <w:r>
+        <w:t>l'aiuto è dato da cittadini, negozianti e vigili, senza compensi.</w:t>
+      </w:r>
+    </w:p>
+    <w:p>
+      <w:pPr>
+        <w:pStyle w:val="Heading1"/>
+      </w:pPr>
+      <w:r>
+        <w:t>3. Costi di setup e sviluppo (una tantum)</w:t>
+      </w:r>
+    </w:p>
+    <w:p>
+      <w:pPr>
+        <w:spacing w:after="120"/>
+      </w:pPr>
+      <w:r>
+        <w:t>Questa voce copre l'analisi, lo sviluppo dell'app, la configurazione dei servizi cloud, la produzione dei cartelli con QR e la stampa del materiale informativo per la popolazione.</w:t>
       </w:r>
     </w:p>
     <w:tbl>
@@ -94,7 +445,7 @@
       <w:tr>
         <w:tc>
           <w:tcPr>
-            <w:tcW w:type="dxa" w:w="2381"/>
+            <w:tcW w:type="dxa" w:w="2268"/>
             <w:shd w:val="clear" w:color="auto" w:fill="1F4E79"/>
           </w:tcPr>
           <w:p>
@@ -126,7 +477,7 @@
         </w:tc>
         <w:tc>
           <w:tcPr>
-            <w:tcW w:type="dxa" w:w="1474"/>
+            <w:tcW w:type="dxa" w:w="1531"/>
             <w:shd w:val="clear" w:color="auto" w:fill="1F4E79"/>
           </w:tcPr>
           <w:p>
@@ -136,13 +487,13 @@
                 <w:b/>
                 <w:color w:val="FFFFFF"/>
               </w:rPr>
-              <w:t>Qtà / Dettaglio</w:t>
+              <w:t>Quantità</w:t>
             </w:r>
           </w:p>
         </w:tc>
         <w:tc>
           <w:tcPr>
-            <w:tcW w:type="dxa" w:w="1474"/>
+            <w:tcW w:type="dxa" w:w="1531"/>
             <w:shd w:val="clear" w:color="auto" w:fill="1F4E79"/>
           </w:tcPr>
           <w:p>
@@ -163,7 +514,7 @@
       <w:tr>
         <w:tc>
           <w:tcPr>
-            <w:tcW w:type="dxa" w:w="2381"/>
+            <w:tcW w:type="dxa" w:w="2268"/>
           </w:tcPr>
           <w:p>
             <w:r/>
@@ -191,7 +542,7 @@
         </w:tc>
         <w:tc>
           <w:tcPr>
-            <w:tcW w:type="dxa" w:w="1474"/>
+            <w:tcW w:type="dxa" w:w="1531"/>
           </w:tcPr>
           <w:p>
             <w:r/>
@@ -205,7 +556,7 @@
         </w:tc>
         <w:tc>
           <w:tcPr>
-            <w:tcW w:type="dxa" w:w="1474"/>
+            <w:tcW w:type="dxa" w:w="1531"/>
           </w:tcPr>
           <w:p>
             <w:pPr>
@@ -224,7 +575,7 @@
       <w:tr>
         <w:tc>
           <w:tcPr>
-            <w:tcW w:type="dxa" w:w="2381"/>
+            <w:tcW w:type="dxa" w:w="2268"/>
           </w:tcPr>
           <w:p>
             <w:r/>
@@ -252,7 +603,7 @@
         </w:tc>
         <w:tc>
           <w:tcPr>
-            <w:tcW w:type="dxa" w:w="1474"/>
+            <w:tcW w:type="dxa" w:w="1531"/>
           </w:tcPr>
           <w:p>
             <w:r/>
@@ -266,7 +617,7 @@
         </w:tc>
         <w:tc>
           <w:tcPr>
-            <w:tcW w:type="dxa" w:w="1474"/>
+            <w:tcW w:type="dxa" w:w="1531"/>
           </w:tcPr>
           <w:p>
             <w:pPr>
@@ -285,7 +636,7 @@
       <w:tr>
         <w:tc>
           <w:tcPr>
-            <w:tcW w:type="dxa" w:w="2381"/>
+            <w:tcW w:type="dxa" w:w="2268"/>
           </w:tcPr>
           <w:p>
             <w:r/>
@@ -313,7 +664,7 @@
         </w:tc>
         <w:tc>
           <w:tcPr>
-            <w:tcW w:type="dxa" w:w="1474"/>
+            <w:tcW w:type="dxa" w:w="1531"/>
           </w:tcPr>
           <w:p>
             <w:r/>
@@ -327,7 +678,7 @@
         </w:tc>
         <w:tc>
           <w:tcPr>
-            <w:tcW w:type="dxa" w:w="1474"/>
+            <w:tcW w:type="dxa" w:w="1531"/>
           </w:tcPr>
           <w:p>
             <w:pPr>
@@ -346,7 +697,7 @@
       <w:tr>
         <w:tc>
           <w:tcPr>
-            <w:tcW w:type="dxa" w:w="2381"/>
+            <w:tcW w:type="dxa" w:w="2268"/>
           </w:tcPr>
           <w:p>
             <w:r/>
@@ -354,7 +705,7 @@
               <w:rPr>
                 <w:b/>
               </w:rPr>
-              <w:t>Campagna marketing (volantini)</w:t>
+              <w:t>Campagna informativa (volantini)</w:t>
             </w:r>
           </w:p>
         </w:tc>
@@ -368,13 +719,13 @@
               <w:rPr>
                 <w:b w:val="0"/>
               </w:rPr>
-              <w:t>Ideazione grafica, impaginazione e stampa di volantini informativi per la popolazione (target: ~6.000 abitanti, ipotizzando una copertura del 50% = 3.000 copie).</w:t>
+              <w:t>Ideazione grafica, impaginazione e stampa di volantini informativi per la popolazione. Target: circa 6.000 abitanti, con una copertura stimata del 50%.</w:t>
             </w:r>
           </w:p>
         </w:tc>
         <w:tc>
           <w:tcPr>
-            <w:tcW w:type="dxa" w:w="1474"/>
+            <w:tcW w:type="dxa" w:w="1531"/>
           </w:tcPr>
           <w:p>
             <w:r/>
@@ -388,7 +739,7 @@
         </w:tc>
         <w:tc>
           <w:tcPr>
-            <w:tcW w:type="dxa" w:w="1474"/>
+            <w:tcW w:type="dxa" w:w="1531"/>
           </w:tcPr>
           <w:p>
             <w:pPr>
@@ -407,7 +758,7 @@
       <w:tr>
         <w:tc>
           <w:tcPr>
-            <w:tcW w:type="dxa" w:w="1474"/>
+            <w:tcW w:type="dxa" w:w="1531"/>
             <w:gridSpan w:val="3"/>
             <w:shd w:val="clear" w:color="auto" w:fill="DCE6F1"/>
           </w:tcPr>
@@ -417,13 +768,13 @@
               <w:rPr>
                 <w:b/>
               </w:rPr>
-              <w:t>TOTALE SETUP &amp; AVVIAMENTO</w:t>
+              <w:t>Totale setup e avviamento</w:t>
             </w:r>
           </w:p>
         </w:tc>
         <w:tc>
           <w:tcPr>
-            <w:tcW w:type="dxa" w:w="1474"/>
+            <w:tcW w:type="dxa" w:w="1531"/>
             <w:shd w:val="clear" w:color="auto" w:fill="DCE6F1"/>
           </w:tcPr>
           <w:p>
@@ -443,15 +794,23 @@
     </w:tbl>
     <w:p>
       <w:pPr>
+        <w:spacing w:after="0"/>
+      </w:pPr>
+    </w:p>
+    <w:p>
+      <w:pPr>
         <w:pStyle w:val="Heading1"/>
       </w:pPr>
       <w:r>
-        <w:t>2. Costi di mantenimento, infrastruttura e gestione (ricorrenti / annuali)</w:t>
+        <w:t>4. Costi ricorrenti (annuali)</w:t>
       </w:r>
     </w:p>
     <w:p>
+      <w:pPr>
+        <w:spacing w:after="120"/>
+      </w:pPr>
       <w:r>
-        <w:t>Questa voce copre il funzionamento dei servizi, il supporto tecnico, la conservazione dei dati su Supabase e la manutenzione fisica annuale (ristampa e sostituzione dei QR code deteriorati dagli agenti atmosferici).</w:t>
+        <w:t>Questa voce copre il funzionamento dei servizi, il supporto tecnico, la conservazione dei dati e la manutenzione fisica dei cartelli, che ogni anno vengono ristampati e sostituiti perché esposti agli agenti atmosferici.</w:t>
       </w:r>
     </w:p>
     <w:tbl>
@@ -470,7 +829,7 @@
       <w:tr>
         <w:tc>
           <w:tcPr>
-            <w:tcW w:type="dxa" w:w="2381"/>
+            <w:tcW w:type="dxa" w:w="2268"/>
             <w:shd w:val="clear" w:color="auto" w:fill="1F4E79"/>
           </w:tcPr>
           <w:p>
@@ -502,7 +861,7 @@
         </w:tc>
         <w:tc>
           <w:tcPr>
-            <w:tcW w:type="dxa" w:w="1474"/>
+            <w:tcW w:type="dxa" w:w="1361"/>
             <w:shd w:val="clear" w:color="auto" w:fill="1F4E79"/>
           </w:tcPr>
           <w:p>
@@ -518,7 +877,7 @@
         </w:tc>
         <w:tc>
           <w:tcPr>
-            <w:tcW w:type="dxa" w:w="1474"/>
+            <w:tcW w:type="dxa" w:w="1701"/>
             <w:shd w:val="clear" w:color="auto" w:fill="1F4E79"/>
           </w:tcPr>
           <w:p>
@@ -539,7 +898,7 @@
       <w:tr>
         <w:tc>
           <w:tcPr>
-            <w:tcW w:type="dxa" w:w="2381"/>
+            <w:tcW w:type="dxa" w:w="2268"/>
           </w:tcPr>
           <w:p>
             <w:r/>
@@ -547,7 +906,7 @@
               <w:rPr>
                 <w:b/>
               </w:rPr>
-              <w:t>Infrastruttura &amp; database</w:t>
+              <w:t>Infrastruttura e database</w:t>
             </w:r>
           </w:p>
         </w:tc>
@@ -567,7 +926,7 @@
         </w:tc>
         <w:tc>
           <w:tcPr>
-            <w:tcW w:type="dxa" w:w="1474"/>
+            <w:tcW w:type="dxa" w:w="1361"/>
           </w:tcPr>
           <w:p>
             <w:r/>
@@ -581,7 +940,7 @@
         </w:tc>
         <w:tc>
           <w:tcPr>
-            <w:tcW w:type="dxa" w:w="1474"/>
+            <w:tcW w:type="dxa" w:w="1701"/>
           </w:tcPr>
           <w:p>
             <w:pPr>
@@ -600,7 +959,7 @@
       <w:tr>
         <w:tc>
           <w:tcPr>
-            <w:tcW w:type="dxa" w:w="2381"/>
+            <w:tcW w:type="dxa" w:w="2268"/>
           </w:tcPr>
           <w:p>
             <w:r/>
@@ -622,13 +981,13 @@
               <w:rPr>
                 <w:b w:val="0"/>
               </w:rPr>
-              <w:t>Sostituzione programmata annuale (1 volta l'anno) di tutti i 20 QR code (ristampa, impermeabilizzazione e verifica della leggibilità sul campo).</w:t>
+              <w:t>Sostituzione programmata di tutti i 20 QR code una volta l'anno: ristampa, impermeabilizzazione e verifica della leggibilità sul campo.</w:t>
             </w:r>
           </w:p>
         </w:tc>
         <w:tc>
           <w:tcPr>
-            <w:tcW w:type="dxa" w:w="1474"/>
+            <w:tcW w:type="dxa" w:w="1361"/>
           </w:tcPr>
           <w:p>
             <w:r/>
@@ -642,7 +1001,7 @@
         </w:tc>
         <w:tc>
           <w:tcPr>
-            <w:tcW w:type="dxa" w:w="1474"/>
+            <w:tcW w:type="dxa" w:w="1701"/>
           </w:tcPr>
           <w:p>
             <w:pPr>
@@ -661,7 +1020,7 @@
       <w:tr>
         <w:tc>
           <w:tcPr>
-            <w:tcW w:type="dxa" w:w="2381"/>
+            <w:tcW w:type="dxa" w:w="2268"/>
           </w:tcPr>
           <w:p>
             <w:r/>
@@ -669,7 +1028,7 @@
               <w:rPr>
                 <w:b/>
               </w:rPr>
-              <w:t>Aggiornamenti &amp; supporto PWA</w:t>
+              <w:t>Aggiornamenti e supporto PWA</w:t>
             </w:r>
           </w:p>
         </w:tc>
@@ -683,13 +1042,13 @@
               <w:rPr>
                 <w:b w:val="0"/>
               </w:rPr>
-              <w:t>Piccole manutenzioni evolutive, verifica compatibilità browser e sicurezza delle PWA.</w:t>
+              <w:t>Piccole manutenzioni evolutive, verifica della compatibilità con i browser e della sicurezza dell'app.</w:t>
             </w:r>
           </w:p>
         </w:tc>
         <w:tc>
           <w:tcPr>
-            <w:tcW w:type="dxa" w:w="1474"/>
+            <w:tcW w:type="dxa" w:w="1361"/>
           </w:tcPr>
           <w:p>
             <w:r/>
@@ -703,7 +1062,7 @@
         </w:tc>
         <w:tc>
           <w:tcPr>
-            <w:tcW w:type="dxa" w:w="1474"/>
+            <w:tcW w:type="dxa" w:w="1701"/>
           </w:tcPr>
           <w:p>
             <w:pPr>
@@ -722,7 +1081,7 @@
       <w:tr>
         <w:tc>
           <w:tcPr>
-            <w:tcW w:type="dxa" w:w="1474"/>
+            <w:tcW w:type="dxa" w:w="1361"/>
             <w:gridSpan w:val="3"/>
             <w:shd w:val="clear" w:color="auto" w:fill="DCE6F1"/>
           </w:tcPr>
@@ -732,13 +1091,13 @@
               <w:rPr>
                 <w:b/>
               </w:rPr>
-              <w:t>TOTALE CANONE ANNUALE</w:t>
+              <w:t>Totale canone annuale</w:t>
             </w:r>
           </w:p>
         </w:tc>
         <w:tc>
           <w:tcPr>
-            <w:tcW w:type="dxa" w:w="1474"/>
+            <w:tcW w:type="dxa" w:w="1701"/>
             <w:shd w:val="clear" w:color="auto" w:fill="DCE6F1"/>
           </w:tcPr>
           <w:p>
@@ -758,10 +1117,338 @@
     </w:tbl>
     <w:p>
       <w:pPr>
+        <w:spacing w:after="0"/>
+      </w:pPr>
+    </w:p>
+    <w:p>
+      <w:pPr>
         <w:pStyle w:val="Heading1"/>
       </w:pPr>
       <w:r>
-        <w:t>Note e condizioni di fornitura</w:t>
+        <w:t>5. Proiezione su tre anni</w:t>
+      </w:r>
+    </w:p>
+    <w:p>
+      <w:pPr>
+        <w:spacing w:after="120"/>
+      </w:pPr>
+      <w:r>
+        <w:t>Il costo complessivo dei primi tre anni di servizio è di € 4.950,00.</w:t>
+      </w:r>
+    </w:p>
+    <w:tbl>
+      <w:tblPr>
+        <w:tblStyle w:val="TableGrid"/>
+        <w:tblW w:type="auto" w:w="0"/>
+        <w:jc w:val="center"/>
+        <w:tblLook w:firstColumn="1" w:firstRow="1" w:lastColumn="0" w:lastRow="0" w:noHBand="0" w:noVBand="1" w:val="04A0"/>
+      </w:tblPr>
+      <w:tblGrid>
+        <w:gridCol w:w="2409"/>
+        <w:gridCol w:w="2409"/>
+        <w:gridCol w:w="2409"/>
+        <w:gridCol w:w="2409"/>
+      </w:tblGrid>
+      <w:tr>
+        <w:tc>
+          <w:tcPr>
+            <w:tcW w:type="dxa" w:w="2268"/>
+            <w:shd w:val="clear" w:color="auto" w:fill="1F4E79"/>
+          </w:tcPr>
+          <w:p>
+            <w:r/>
+            <w:r>
+              <w:rPr>
+                <w:b/>
+                <w:color w:val="FFFFFF"/>
+              </w:rPr>
+              <w:t>Anno</w:t>
+            </w:r>
+          </w:p>
+        </w:tc>
+        <w:tc>
+          <w:tcPr>
+            <w:tcW w:type="dxa" w:w="2438"/>
+            <w:shd w:val="clear" w:color="auto" w:fill="1F4E79"/>
+          </w:tcPr>
+          <w:p>
+            <w:r/>
+            <w:r>
+              <w:rPr>
+                <w:b/>
+                <w:color w:val="FFFFFF"/>
+              </w:rPr>
+              <w:t>Setup</w:t>
+            </w:r>
+          </w:p>
+        </w:tc>
+        <w:tc>
+          <w:tcPr>
+            <w:tcW w:type="dxa" w:w="2438"/>
+            <w:shd w:val="clear" w:color="auto" w:fill="1F4E79"/>
+          </w:tcPr>
+          <w:p>
+            <w:r/>
+            <w:r>
+              <w:rPr>
+                <w:b/>
+                <w:color w:val="FFFFFF"/>
+              </w:rPr>
+              <w:t>Canone</w:t>
+            </w:r>
+          </w:p>
+        </w:tc>
+        <w:tc>
+          <w:tcPr>
+            <w:tcW w:type="dxa" w:w="2494"/>
+            <w:shd w:val="clear" w:color="auto" w:fill="1F4E79"/>
+          </w:tcPr>
+          <w:p>
+            <w:pPr>
+              <w:jc w:val="right"/>
+            </w:pPr>
+            <w:r/>
+            <w:r>
+              <w:rPr>
+                <w:b/>
+                <w:color w:val="FFFFFF"/>
+              </w:rPr>
+              <w:t>Totale anno</w:t>
+            </w:r>
+          </w:p>
+        </w:tc>
+      </w:tr>
+      <w:tr>
+        <w:tc>
+          <w:tcPr>
+            <w:tcW w:type="dxa" w:w="2268"/>
+          </w:tcPr>
+          <w:p>
+            <w:r/>
+            <w:r>
+              <w:rPr>
+                <w:b/>
+              </w:rPr>
+              <w:t>1° anno</w:t>
+            </w:r>
+          </w:p>
+        </w:tc>
+        <w:tc>
+          <w:tcPr>
+            <w:tcW w:type="dxa" w:w="2438"/>
+          </w:tcPr>
+          <w:p>
+            <w:r/>
+            <w:r>
+              <w:rPr>
+                <w:b w:val="0"/>
+              </w:rPr>
+              <w:t>€ 2.550,00</w:t>
+            </w:r>
+          </w:p>
+        </w:tc>
+        <w:tc>
+          <w:tcPr>
+            <w:tcW w:type="dxa" w:w="2438"/>
+          </w:tcPr>
+          <w:p>
+            <w:r/>
+            <w:r>
+              <w:rPr>
+                <w:b w:val="0"/>
+              </w:rPr>
+              <w:t>€ 800,00</w:t>
+            </w:r>
+          </w:p>
+        </w:tc>
+        <w:tc>
+          <w:tcPr>
+            <w:tcW w:type="dxa" w:w="2494"/>
+          </w:tcPr>
+          <w:p>
+            <w:pPr>
+              <w:jc w:val="right"/>
+            </w:pPr>
+            <w:r/>
+            <w:r>
+              <w:rPr>
+                <w:b w:val="0"/>
+              </w:rPr>
+              <w:t>€ 3.350,00</w:t>
+            </w:r>
+          </w:p>
+        </w:tc>
+      </w:tr>
+      <w:tr>
+        <w:tc>
+          <w:tcPr>
+            <w:tcW w:type="dxa" w:w="2268"/>
+          </w:tcPr>
+          <w:p>
+            <w:r/>
+            <w:r>
+              <w:rPr>
+                <w:b/>
+              </w:rPr>
+              <w:t>2° anno</w:t>
+            </w:r>
+          </w:p>
+        </w:tc>
+        <w:tc>
+          <w:tcPr>
+            <w:tcW w:type="dxa" w:w="2438"/>
+          </w:tcPr>
+          <w:p>
+            <w:r/>
+            <w:r>
+              <w:rPr>
+                <w:b w:val="0"/>
+              </w:rPr>
+              <w:t>—</w:t>
+            </w:r>
+          </w:p>
+        </w:tc>
+        <w:tc>
+          <w:tcPr>
+            <w:tcW w:type="dxa" w:w="2438"/>
+          </w:tcPr>
+          <w:p>
+            <w:r/>
+            <w:r>
+              <w:rPr>
+                <w:b w:val="0"/>
+              </w:rPr>
+              <w:t>€ 800,00</w:t>
+            </w:r>
+          </w:p>
+        </w:tc>
+        <w:tc>
+          <w:tcPr>
+            <w:tcW w:type="dxa" w:w="2494"/>
+          </w:tcPr>
+          <w:p>
+            <w:pPr>
+              <w:jc w:val="right"/>
+            </w:pPr>
+            <w:r/>
+            <w:r>
+              <w:rPr>
+                <w:b w:val="0"/>
+              </w:rPr>
+              <w:t>€ 800,00</w:t>
+            </w:r>
+          </w:p>
+        </w:tc>
+      </w:tr>
+      <w:tr>
+        <w:tc>
+          <w:tcPr>
+            <w:tcW w:type="dxa" w:w="2268"/>
+          </w:tcPr>
+          <w:p>
+            <w:r/>
+            <w:r>
+              <w:rPr>
+                <w:b/>
+              </w:rPr>
+              <w:t>3° anno</w:t>
+            </w:r>
+          </w:p>
+        </w:tc>
+        <w:tc>
+          <w:tcPr>
+            <w:tcW w:type="dxa" w:w="2438"/>
+          </w:tcPr>
+          <w:p>
+            <w:r/>
+            <w:r>
+              <w:rPr>
+                <w:b w:val="0"/>
+              </w:rPr>
+              <w:t>—</w:t>
+            </w:r>
+          </w:p>
+        </w:tc>
+        <w:tc>
+          <w:tcPr>
+            <w:tcW w:type="dxa" w:w="2438"/>
+          </w:tcPr>
+          <w:p>
+            <w:r/>
+            <w:r>
+              <w:rPr>
+                <w:b w:val="0"/>
+              </w:rPr>
+              <w:t>€ 800,00</w:t>
+            </w:r>
+          </w:p>
+        </w:tc>
+        <w:tc>
+          <w:tcPr>
+            <w:tcW w:type="dxa" w:w="2494"/>
+          </w:tcPr>
+          <w:p>
+            <w:pPr>
+              <w:jc w:val="right"/>
+            </w:pPr>
+            <w:r/>
+            <w:r>
+              <w:rPr>
+                <w:b w:val="0"/>
+              </w:rPr>
+              <w:t>€ 800,00</w:t>
+            </w:r>
+          </w:p>
+        </w:tc>
+      </w:tr>
+      <w:tr>
+        <w:tc>
+          <w:tcPr>
+            <w:tcW w:type="dxa" w:w="2438"/>
+            <w:gridSpan w:val="3"/>
+            <w:shd w:val="clear" w:color="auto" w:fill="DCE6F1"/>
+          </w:tcPr>
+          <w:p>
+            <w:r/>
+            <w:r>
+              <w:rPr>
+                <w:b/>
+              </w:rPr>
+              <w:t>Totale tre anni</w:t>
+            </w:r>
+          </w:p>
+        </w:tc>
+        <w:tc>
+          <w:tcPr>
+            <w:tcW w:type="dxa" w:w="2494"/>
+            <w:shd w:val="clear" w:color="auto" w:fill="DCE6F1"/>
+          </w:tcPr>
+          <w:p>
+            <w:pPr>
+              <w:jc w:val="right"/>
+            </w:pPr>
+            <w:r/>
+            <w:r>
+              <w:rPr>
+                <w:b/>
+              </w:rPr>
+              <w:t>€ 4.950,00</w:t>
+            </w:r>
+          </w:p>
+        </w:tc>
+      </w:tr>
+    </w:tbl>
+    <w:p>
+      <w:pPr>
+        <w:spacing w:after="0"/>
+      </w:pPr>
+    </w:p>
+    <w:p>
+      <w:pPr>
+        <w:pStyle w:val="Heading1"/>
+      </w:pPr>
+      <w:r>
+        <w:t>6. Note e condizioni di fornitura</w:t>
       </w:r>
     </w:p>
     <w:p>
@@ -786,13 +1473,30 @@
         <w:rPr>
           <w:b/>
         </w:rPr>
-        <w:t xml:space="preserve">Modalità di pagamento concordabili: </w:t>
+        <w:t xml:space="preserve">Modalità di pagamento: </w:t>
       </w:r>
       <w:r>
-        <w:t>es. 50% all'approvazione, 50% al collaudo e messa online.</w:t>
+        <w:t>da concordare, ad esempio 50% all'approvazione e 50% al collaudo e alla messa online.</w:t>
+      </w:r>
+    </w:p>
+    <w:p>
+      <w:pPr>
+        <w:spacing w:before="560"/>
+      </w:pPr>
+      <w:r>
+        <w:rPr>
+          <w:b/>
+        </w:rPr>
+        <w:t>Per Intré</w:t>
+      </w:r>
+    </w:p>
+    <w:p>
+      <w:r>
+        <w:t>______________________________</w:t>
       </w:r>
     </w:p>
     <w:sectPr>
+      <w:footerReference w:type="default" r:id="rId9"/>
       <w:pgSz w:w="11906" w:h="16838"/>
       <w:pgMar w:top="1134" w:right="1134" w:bottom="1134" w:left="1134" w:header="720" w:footer="720" w:gutter="0"/>
       <w:cols w:space="720"/>
@@ -800,6 +1504,24 @@
     </w:sectPr>
   </w:body>
 </w:document>
+</file>
+
+<file path=word/footer1.xml><?xml version="1.0" encoding="utf-8"?>
+<w:ftr xmlns:m="http://schemas.openxmlformats.org/officeDocument/2006/math" xmlns:mc="http://schemas.openxmlformats.org/markup-compatibility/2006" xmlns:mo="http://schemas.microsoft.com/office/mac/office/2008/main" xmlns:mv="urn:schemas-microsoft-com:mac:vml" xmlns:o="urn:schemas-microsoft-com:office:office" xmlns:r="http://schemas.openxmlformats.org/officeDocument/2006/relationships" xmlns:v="urn:schemas-microsoft-com:vml" xmlns:w10="urn:schemas-microsoft-com:office:word" xmlns:w14="http://schemas.microsoft.com/office/word/2010/wordml" xmlns:w="http://schemas.openxmlformats.org/wordprocessingml/2006/main" xmlns:wne="http://schemas.microsoft.com/office/word/2006/wordml" xmlns:wp14="http://schemas.microsoft.com/office/word/2010/wordprocessingDrawing" xmlns:wp="http://schemas.openxmlformats.org/drawingml/2006/wordprocessingDrawing" xmlns:wpc="http://schemas.microsoft.com/office/word/2010/wordprocessingCanvas" xmlns:wpg="http://schemas.microsoft.com/office/word/2010/wordprocessingGroup" xmlns:wpi="http://schemas.microsoft.com/office/word/2010/wordprocessingInk" xmlns:wps="http://schemas.microsoft.com/office/word/2010/wordprocessingShape" mc:Ignorable="w14 wp14">
+  <w:p>
+    <w:pPr>
+      <w:pStyle w:val="Footer"/>
+      <w:jc w:val="center"/>
+    </w:pPr>
+    <w:r>
+      <w:rPr>
+        <w:color w:val="595959"/>
+        <w:sz w:val="17"/>
+      </w:rPr>
+      <w:t>AttraversiAMO · Offerta economica · Intré</w:t>
+    </w:r>
+  </w:p>
+</w:ftr>
 </file>
 
 <file path=word/numbering.xml><?xml version="1.0" encoding="utf-8"?>
@@ -1253,11 +1975,11 @@
       <w:outlineLvl w:val="1"/>
     </w:pPr>
     <w:rPr>
-      <w:rFonts w:asciiTheme="majorHAnsi" w:eastAsiaTheme="majorEastAsia" w:hAnsiTheme="majorHAnsi" w:cstheme="majorBidi"/>
+      <w:rFonts w:asciiTheme="majorHAnsi" w:eastAsiaTheme="majorEastAsia" w:hAnsiTheme="majorHAnsi" w:cstheme="majorBidi" w:ascii="Calibri" w:hAnsi="Calibri"/>
       <w:b/>
       <w:bCs/>
-      <w:color w:val="4F81BD" w:themeColor="accent1"/>
-      <w:sz w:val="26"/>
+      <w:color w:val="1F4E79"/>
+      <w:sz w:val="23"/>
       <w:szCs w:val="26"/>
     </w:rPr>
   </w:style>
@@ -1523,7 +2245,7 @@
       <w:color w:val="1F4E79"/>
       <w:spacing w:val="5"/>
       <w:kern w:val="28"/>
-      <w:sz w:val="48"/>
+      <w:sz w:val="52"/>
       <w:szCs w:val="52"/>
     </w:rPr>
   </w:style>

</xml_diff>

<commit_message>
docs: fill in costs in the technical report and align the offer
The infrastructure and costs section of the technical report now uses
the figures of the economic offer (EUR 2,550 setup + EUR 800/year). The
offer now describes one PWA for elders and volunteers plus the
Municipality dashboard, deployed on GitHub Pages instead of Vercel.

Co-Authored-By: Claude Opus 5.5 <noreply@anthropic.com>
</commit_message>
<xml_diff>
--- a/relazione/offerta-economica.docx
+++ b/relazione/offerta-economica.docx
@@ -536,7 +536,7 @@
               <w:rPr>
                 <w:b w:val="0"/>
               </w:rPr>
-              <w:t>Sviluppo delle 2 PWA (Utenti/Caregiver + Dashboard Statistiche Comune) ottimizzate per dispositivi mobili e desktop.</w:t>
+              <w:t>Sviluppo della PWA per anziani e volontari e della dashboard del Comune, ottimizzate per telefono e computer.</w:t>
             </w:r>
           </w:p>
         </w:tc>
@@ -597,7 +597,7 @@
               <w:rPr>
                 <w:b w:val="0"/>
               </w:rPr>
-              <w:t>Setup repository GitHub, configurazione GitHub Pages, pipeline di deploy su Vercel e configurazione database Supabase per le statistiche.</w:t>
+              <w:t>Setup repository GitHub, pubblicazione automatica su GitHub Pages e configurazione del database Supabase per richieste e statistiche.</w:t>
             </w:r>
           </w:p>
         </w:tc>

</xml_diff>